<commit_message>
docs(entrega): actualizar la guia de APIs y la evidencia de pruebas
- Carrito: el campo es `personalizacion`, no `personalizacion_json`.
- Pago con tarjeta: ya usa Recurrente (url_pago, 503 sin claves).
- Codigos 409 y 503, elaboracion automatica y reglas de la entrega.
- Repartidores y reporte: ya no responden 500.

Co-Authored-By: Claude Opus 5.5 <noreply@anthropic.com>
</commit_message>
<xml_diff>
--- a/docs/entrega/fuentes/Evidencia de pruebas - UMG Personaliza.docx
+++ b/docs/entrega/fuentes/Evidencia de pruebas - UMG Personaliza.docx
@@ -16287,7 +16287,7 @@
               <w:rPr>
                 <w:sz w:val="18"/>
               </w:rPr>
-              <w:t xml:space="preserve">Listar repartidores respondía 500 siempre: consultaba la tabla </w:t>
+              <w:t xml:space="preserve">Listar repartidores y exportar su reporte respondían 500 siempre: consultaban la tabla </w:t>
             </w:r>
             <w:r>
               <w:rPr>
@@ -16315,7 +16315,7 @@
               <w:rPr>
                 <w:sz w:val="18"/>
               </w:rPr>
-              <w:t>Caja negra</w:t>
+              <w:t>Caja negra y revisión de la guía de APIs</w:t>
             </w:r>
           </w:p>
         </w:tc>
@@ -16329,7 +16329,7 @@
               <w:rPr>
                 <w:sz w:val="18"/>
               </w:rPr>
-              <w:t>Se obtienen de los usuarios con rol Repartidor y de la bitácora de accesos</w:t>
+              <w:t>Una sola consulta sobre los usuarios con rol Repartidor y la bitácora de accesos, usada por el listado y por el reporte (xlsx y pdf)</w:t>
             </w:r>
           </w:p>
         </w:tc>

</xml_diff>